<commit_message>
Changes to bib file and ethics paper
</commit_message>
<xml_diff>
--- a/debatt/homogent_fält/Henrik F sista_HF.docx
+++ b/debatt/homogent_fält/Henrik F sista_HF.docx
@@ -73,35 +73,64 @@
       <w:r>
         <w:t xml:space="preserve">I </w:t>
       </w:r>
-      <w:r>
-        <w:rPr>
-          <w:strike/>
-          <w:rPrChange w:id="0" w:author="Henrik Frisk" w:date="2025-03-30T14:55:00Z" w16du:dateUtc="2025-03-30T12:55:00Z">
-            <w:rPr/>
+      <w:del w:id="0" w:author="Henrik Frisk" w:date="2026-01-01T17:20:00Z" w16du:dateUtc="2026-01-01T16:20:00Z">
+        <w:r>
+          <w:rPr>
+            <w:strike/>
+          </w:rPr>
+          <w:delText>diskussioner</w:delText>
+        </w:r>
+        <w:r>
+          <w:delText xml:space="preserve"> </w:delText>
+        </w:r>
+      </w:del>
+      <w:r>
+        <w:rPr>
+          <w:color w:val="000000" w:themeColor="text1"/>
+          <w:rPrChange w:id="1" w:author="Henrik Frisk" w:date="2026-01-01T17:20:00Z" w16du:dateUtc="2026-01-01T16:20:00Z">
+            <w:rPr>
+              <w:color w:val="FF0000"/>
+            </w:rPr>
           </w:rPrChange>
         </w:rPr>
-        <w:t>diskussioner</w:t>
-      </w:r>
-      <w:r>
-        <w:t xml:space="preserve"> </w:t>
-      </w:r>
-      <w:r>
-        <w:rPr>
-          <w:color w:val="FF0000"/>
-          <w:rPrChange w:id="1" w:author="Henrik Frisk" w:date="2025-03-30T14:55:00Z" w16du:dateUtc="2025-03-30T12:55:00Z">
-            <w:rPr/>
+        <w:t>de</w:t>
+      </w:r>
+      <w:ins w:id="2" w:author="Henrik Frisk" w:date="2026-01-01T17:20:00Z" w16du:dateUtc="2026-01-01T16:20:00Z">
+        <w:r>
+          <w:rPr>
+            <w:color w:val="000000" w:themeColor="text1"/>
+            <w:rPrChange w:id="3" w:author="Henrik Frisk" w:date="2026-01-01T17:20:00Z" w16du:dateUtc="2026-01-01T16:20:00Z">
+              <w:rPr>
+                <w:color w:val="FF0000"/>
+              </w:rPr>
+            </w:rPrChange>
+          </w:rPr>
+          <w:t>b</w:t>
+        </w:r>
+      </w:ins>
+      <w:del w:id="4" w:author="Henrik Frisk" w:date="2026-01-01T17:20:00Z" w16du:dateUtc="2026-01-01T16:20:00Z">
+        <w:r>
+          <w:rPr>
+            <w:color w:val="000000" w:themeColor="text1"/>
+            <w:rPrChange w:id="5" w:author="Henrik Frisk" w:date="2026-01-01T17:20:00Z" w16du:dateUtc="2026-01-01T16:20:00Z">
+              <w:rPr>
+                <w:color w:val="FF0000"/>
+              </w:rPr>
+            </w:rPrChange>
+          </w:rPr>
+          <w:delText>b</w:delText>
+        </w:r>
+      </w:del>
+      <w:r>
+        <w:rPr>
+          <w:color w:val="000000" w:themeColor="text1"/>
+          <w:rPrChange w:id="6" w:author="Henrik Frisk" w:date="2026-01-01T17:20:00Z" w16du:dateUtc="2026-01-01T16:20:00Z">
+            <w:rPr>
+              <w:color w:val="FF0000"/>
+            </w:rPr>
           </w:rPrChange>
         </w:rPr>
-        <w:t>debatter</w:t>
-      </w:r>
-      <w:r>
-        <w:rPr>
-          <w:color w:val="FF0000"/>
-          <w:rPrChange w:id="2" w:author="Henrik Frisk" w:date="2025-03-30T14:55:00Z" w16du:dateUtc="2025-03-30T12:55:00Z">
-            <w:rPr/>
-          </w:rPrChange>
-        </w:rPr>
-        <w:t xml:space="preserve"> </w:t>
+        <w:t xml:space="preserve">atter </w:t>
       </w:r>
       <w:r>
         <w:t xml:space="preserve">där konstnärlig forskning har diskuterats betraktas den ofta som ett gemensamt fält, eller i vissa fall ett ämne. Det är inte så konstigt, det </w:t>
@@ -495,165 +524,64 @@
       <w:r>
         <w:t xml:space="preserve">, Lyra, "Statstrogna konstnärer utan publik", Respons september 2024)) Om man inte tror på den andra principen, att forskaren kan utvinna denna kunskap ur sin </w:t>
       </w:r>
-      <w:r>
-        <w:rPr>
-          <w:strike/>
-          <w:rPrChange w:id="3" w:author="Henrik Frisk" w:date="2025-03-30T14:56:00Z" w16du:dateUtc="2025-03-30T12:56:00Z">
-            <w:rPr/>
-          </w:rPrChange>
-        </w:rPr>
-        <w:t>egen</w:t>
-      </w:r>
-      <w:r>
-        <w:t xml:space="preserve"> </w:t>
-      </w:r>
-      <w:r>
-        <w:rPr>
-          <w:color w:val="FF0000"/>
-          <w:rPrChange w:id="4" w:author="Henrik Frisk" w:date="2025-03-30T14:56:00Z" w16du:dateUtc="2025-03-30T12:56:00Z">
-            <w:rPr/>
-          </w:rPrChange>
-        </w:rPr>
-        <w:t>konstnärliga</w:t>
-      </w:r>
-      <w:r>
-        <w:rPr>
-          <w:color w:val="FF0000"/>
-          <w:rPrChange w:id="5" w:author="Henrik Frisk" w:date="2025-03-30T14:56:00Z" w16du:dateUtc="2025-03-30T12:56:00Z">
-            <w:rPr/>
-          </w:rPrChange>
-        </w:rPr>
-        <w:t xml:space="preserve"> </w:t>
-      </w:r>
-      <w:r>
-        <w:t xml:space="preserve">praktik på ett sätt som bidrar till en breddning och fördjupning av kunskapsfältet för konst i allmänhet, är </w:t>
-      </w:r>
-      <w:r>
-        <w:rPr>
-          <w:strike/>
-          <w:rPrChange w:id="6" w:author="Henrik Frisk" w:date="2025-03-30T14:56:00Z" w16du:dateUtc="2025-03-30T12:56:00Z">
-            <w:rPr/>
-          </w:rPrChange>
-        </w:rPr>
-        <w:t>det heller inte möjligt att förstå</w:t>
-      </w:r>
-      <w:del w:id="7" w:author="Henrik Frisk" w:date="2025-03-30T14:48:00Z" w16du:dateUtc="2025-03-30T12:48:00Z">
+      <w:del w:id="7" w:author="Henrik Frisk" w:date="2026-01-01T17:20:00Z" w16du:dateUtc="2026-01-01T16:20:00Z">
+        <w:r>
+          <w:rPr>
+            <w:strike/>
+          </w:rPr>
+          <w:delText>egen</w:delText>
+        </w:r>
         <w:r>
           <w:delText xml:space="preserve"> </w:delText>
         </w:r>
       </w:del>
       <w:r>
-        <w:t xml:space="preserve">poängen med </w:t>
-      </w:r>
-      <w:del w:id="8" w:author="Henrik Frisk" w:date="2025-03-30T14:49:00Z" w16du:dateUtc="2025-03-30T12:49:00Z">
+        <w:rPr>
+          <w:color w:val="000000" w:themeColor="text1"/>
+          <w:rPrChange w:id="8" w:author="Henrik Frisk" w:date="2026-01-01T17:20:00Z" w16du:dateUtc="2026-01-01T16:20:00Z">
+            <w:rPr>
+              <w:color w:val="FF0000"/>
+            </w:rPr>
+          </w:rPrChange>
+        </w:rPr>
+        <w:t xml:space="preserve">konstnärliga </w:t>
+      </w:r>
+      <w:r>
+        <w:t xml:space="preserve">praktik på ett sätt som bidrar till en breddning och fördjupning av kunskapsfältet för konst i allmänhet, är </w:t>
+      </w:r>
+      <w:del w:id="9" w:author="Henrik Frisk" w:date="2026-01-01T17:20:00Z" w16du:dateUtc="2026-01-01T16:20:00Z">
         <w:r>
           <w:rPr>
             <w:strike/>
-            <w:rPrChange w:id="9" w:author="Henrik Frisk" w:date="2025-03-30T14:56:00Z" w16du:dateUtc="2025-03-30T12:56:00Z">
-              <w:rPr/>
-            </w:rPrChange>
           </w:rPr>
-          <w:delText xml:space="preserve">denna typ av </w:delText>
+          <w:delText>det heller inte möjligt att förstå</w:delText>
         </w:r>
       </w:del>
       <w:r>
-        <w:rPr>
-          <w:color w:val="FF0000"/>
+        <w:t xml:space="preserve">poängen med </w:t>
+      </w:r>
+      <w:r>
+        <w:rPr>
+          <w:color w:val="000000" w:themeColor="text1"/>
+          <w:rPrChange w:id="10" w:author="Henrik Frisk" w:date="2026-01-01T17:19:00Z" w16du:dateUtc="2026-01-01T16:19:00Z">
+            <w:rPr>
+              <w:color w:val="FF0000"/>
+            </w:rPr>
+          </w:rPrChange>
         </w:rPr>
         <w:t>forskning</w:t>
       </w:r>
-      <w:ins w:id="10" w:author="Henrik Frisk" w:date="2025-03-30T14:49:00Z" w16du:dateUtc="2025-03-30T12:49:00Z">
-        <w:r>
-          <w:rPr>
-            <w:color w:val="FF0000"/>
-          </w:rPr>
-          <w:t xml:space="preserve">en </w:t>
-        </w:r>
-        <w:r>
-          <w:rPr>
-            <w:color w:val="FF0000"/>
-          </w:rPr>
-          <w:t xml:space="preserve">också svår att uppskatta. </w:t>
-        </w:r>
-        <w:r>
-          <w:rPr>
-            <w:color w:val="FF0000"/>
-          </w:rPr>
-          <w:t>E</w:t>
-        </w:r>
-      </w:ins>
-      <w:ins w:id="11" w:author="Henrik Frisk" w:date="2025-03-30T14:50:00Z" w16du:dateUtc="2025-03-30T12:50:00Z">
-        <w:r>
-          <w:rPr>
-            <w:color w:val="FF0000"/>
-          </w:rPr>
-          <w:t>n k</w:t>
-        </w:r>
-      </w:ins>
-      <w:ins w:id="12" w:author="Henrik Frisk" w:date="2025-03-30T14:49:00Z" w16du:dateUtc="2025-03-30T12:49:00Z">
-        <w:r>
-          <w:rPr>
-            <w:color w:val="FF0000"/>
-          </w:rPr>
-          <w:t xml:space="preserve">ritik </w:t>
-        </w:r>
-      </w:ins>
-      <w:ins w:id="13" w:author="Henrik Frisk" w:date="2025-03-30T14:50:00Z" w16du:dateUtc="2025-03-30T12:50:00Z">
-        <w:r>
-          <w:rPr>
-            <w:color w:val="FF0000"/>
-          </w:rPr>
-          <w:t>mot</w:t>
-        </w:r>
-      </w:ins>
-      <w:ins w:id="14" w:author="Henrik Frisk" w:date="2025-03-30T14:49:00Z" w16du:dateUtc="2025-03-30T12:49:00Z">
-        <w:r>
-          <w:rPr>
-            <w:color w:val="FF0000"/>
-          </w:rPr>
-          <w:t xml:space="preserve"> konstnärlig forskning </w:t>
-        </w:r>
-      </w:ins>
-      <w:ins w:id="15" w:author="Henrik Frisk" w:date="2025-03-30T14:50:00Z" w16du:dateUtc="2025-03-30T12:50:00Z">
-        <w:r>
-          <w:rPr>
-            <w:color w:val="FF0000"/>
-          </w:rPr>
-          <w:t xml:space="preserve">är till exempel att den </w:t>
-        </w:r>
-      </w:ins>
-      <w:ins w:id="16" w:author="Henrik Frisk" w:date="2025-03-30T14:49:00Z" w16du:dateUtc="2025-03-30T12:49:00Z">
-        <w:r>
-          <w:rPr>
-            <w:color w:val="FF0000"/>
-          </w:rPr>
-          <w:t xml:space="preserve">blir solipsistisk och att det </w:t>
-        </w:r>
-      </w:ins>
-      <w:ins w:id="17" w:author="Henrik Frisk" w:date="2025-03-30T14:50:00Z" w16du:dateUtc="2025-03-30T12:50:00Z">
-        <w:r>
-          <w:rPr>
-            <w:color w:val="FF0000"/>
-          </w:rPr>
-          <w:t xml:space="preserve">i allmänhet är </w:t>
-        </w:r>
-      </w:ins>
-      <w:ins w:id="18" w:author="Henrik Frisk" w:date="2025-03-30T14:49:00Z" w16du:dateUtc="2025-03-30T12:49:00Z">
-        <w:r>
-          <w:rPr>
-            <w:color w:val="FF0000"/>
-          </w:rPr>
-          <w:t>svårt att bedriva forskning på sin egen praktik</w:t>
-        </w:r>
-      </w:ins>
-      <w:ins w:id="19" w:author="Henrik Frisk" w:date="2025-03-30T14:50:00Z" w16du:dateUtc="2025-03-30T12:50:00Z">
-        <w:r>
-          <w:rPr>
-            <w:color w:val="FF0000"/>
-          </w:rPr>
-          <w:t>.</w:t>
-        </w:r>
-      </w:ins>
+      <w:r>
+        <w:rPr>
+          <w:color w:val="000000" w:themeColor="text1"/>
+          <w:rPrChange w:id="11" w:author="Henrik Frisk" w:date="2026-01-01T17:19:00Z" w16du:dateUtc="2026-01-01T16:19:00Z">
+            <w:rPr>
+              <w:color w:val="FF0000"/>
+            </w:rPr>
+          </w:rPrChange>
+        </w:rPr>
+        <w:t>en också svår att uppskatta. En kritik mot konstnärlig forskning är till exempel att den blir solipsistisk och att det i allmänhet är svårt att bedriva forskning på sin egen praktik.</w:t>
+      </w:r>
     </w:p>
     <w:p>
       <w:pPr>
@@ -1025,11 +953,9 @@
       <w:r>
         <w:t xml:space="preserve"> </w:t>
       </w:r>
-      <w:ins w:id="20" w:author="Henrik Frisk" w:date="2025-03-30T14:51:00Z" w16du:dateUtc="2025-03-30T12:51:00Z">
-        <w:r>
-          <w:t xml:space="preserve">även </w:t>
-        </w:r>
-      </w:ins>
+      <w:r>
+        <w:t xml:space="preserve">även </w:t>
+      </w:r>
       <w:r>
         <w:t>med Staffan Jul</w:t>
       </w:r>
@@ -1075,11 +1001,9 @@
       <w:r>
         <w:t xml:space="preserve">)) Sally Karlsson, i sin text </w:t>
       </w:r>
-      <w:ins w:id="21" w:author="Henrik Frisk" w:date="2025-03-30T14:51:00Z" w16du:dateUtc="2025-03-30T12:51:00Z">
-        <w:r>
-          <w:t>”</w:t>
-        </w:r>
-      </w:ins>
+      <w:r>
+        <w:t>”</w:t>
+      </w:r>
       <w:r>
         <w:t>Nu ä</w:t>
       </w:r>
@@ -1103,11 +1027,9 @@
       <w:r>
         <w:t xml:space="preserve"> akademiserad</w:t>
       </w:r>
-      <w:ins w:id="22" w:author="Henrik Frisk" w:date="2025-03-30T14:51:00Z" w16du:dateUtc="2025-03-30T12:51:00Z">
-        <w:r>
-          <w:t>”</w:t>
-        </w:r>
-      </w:ins>
+      <w:r>
+        <w:t>”</w:t>
+      </w:r>
       <w:r>
         <w:t xml:space="preserve">, menar att akademiseringen av konstutbildningarna redan är fullbordad. </w:t>
       </w:r>
@@ -1224,9 +1146,11 @@
       </w:r>
       <w:r>
         <w:rPr>
-          <w:color w:val="FF0000"/>
-          <w:rPrChange w:id="23" w:author="Henrik Frisk" w:date="2025-03-30T14:57:00Z" w16du:dateUtc="2025-03-30T12:57:00Z">
-            <w:rPr/>
+          <w:color w:val="000000" w:themeColor="text1"/>
+          <w:rPrChange w:id="12" w:author="Henrik Frisk" w:date="2026-01-01T17:19:00Z" w16du:dateUtc="2026-01-01T16:19:00Z">
+            <w:rPr>
+              <w:color w:val="FF0000"/>
+            </w:rPr>
           </w:rPrChange>
         </w:rPr>
         <w:t xml:space="preserve">inom konstområdet </w:t>
@@ -1693,21 +1617,31 @@
       </w:r>
       <w:r>
         <w:rPr>
-          <w:color w:val="FF0000"/>
-          <w:rPrChange w:id="24" w:author="Henrik Frisk" w:date="2025-03-30T14:57:00Z" w16du:dateUtc="2025-03-30T12:57:00Z">
+          <w:color w:val="000000" w:themeColor="text1"/>
+          <w:rPrChange w:id="13" w:author="Henrik Frisk" w:date="2026-01-01T17:21:00Z" w16du:dateUtc="2026-01-01T16:21:00Z">
+            <w:rPr>
+              <w:color w:val="FF0000"/>
+            </w:rPr>
+          </w:rPrChange>
+        </w:rPr>
+        <w:t xml:space="preserve">forskning i olika </w:t>
+      </w:r>
+      <w:r>
+        <w:rPr>
+          <w:color w:val="000000" w:themeColor="text1"/>
+          <w:rPrChange w:id="14" w:author="Henrik Frisk" w:date="2026-01-01T17:21:00Z" w16du:dateUtc="2026-01-01T16:21:00Z">
             <w:rPr/>
           </w:rPrChange>
         </w:rPr>
-        <w:t xml:space="preserve">forskning i olika </w:t>
-      </w:r>
-      <w:r>
         <w:t>konstnärlig</w:t>
       </w:r>
       <w:r>
         <w:rPr>
-          <w:color w:val="FF0000"/>
-          <w:rPrChange w:id="25" w:author="Henrik Frisk" w:date="2025-03-30T14:57:00Z" w16du:dateUtc="2025-03-30T12:57:00Z">
-            <w:rPr/>
+          <w:color w:val="000000" w:themeColor="text1"/>
+          <w:rPrChange w:id="15" w:author="Henrik Frisk" w:date="2026-01-01T17:21:00Z" w16du:dateUtc="2026-01-01T16:21:00Z">
+            <w:rPr>
+              <w:color w:val="FF0000"/>
+            </w:rPr>
           </w:rPrChange>
         </w:rPr>
         <w:t>a</w:t>
@@ -1715,23 +1649,20 @@
       <w:r>
         <w:t xml:space="preserve"> </w:t>
       </w:r>
-      <w:r>
-        <w:rPr>
-          <w:strike/>
-          <w:rPrChange w:id="26" w:author="Henrik Frisk" w:date="2025-03-30T14:57:00Z" w16du:dateUtc="2025-03-30T12:57:00Z">
-            <w:rPr/>
-          </w:rPrChange>
-        </w:rPr>
-        <w:t>forskning</w:t>
-      </w:r>
-      <w:r>
-        <w:t xml:space="preserve"> </w:t>
-      </w:r>
-      <w:ins w:id="27" w:author="Henrik Frisk" w:date="2025-03-30T14:53:00Z" w16du:dateUtc="2025-03-30T12:53:00Z">
+      <w:del w:id="16" w:author="Henrik Frisk" w:date="2026-01-01T17:21:00Z" w16du:dateUtc="2026-01-01T16:21:00Z">
         <w:r>
-          <w:t xml:space="preserve">praktiker </w:t>
+          <w:rPr>
+            <w:strike/>
+          </w:rPr>
+          <w:delText>forskning</w:delText>
         </w:r>
-      </w:ins>
+        <w:r>
+          <w:delText xml:space="preserve"> </w:delText>
+        </w:r>
+      </w:del>
+      <w:r>
+        <w:t xml:space="preserve">praktiker </w:t>
+      </w:r>
       <w:r>
         <w:t>har funnits i m</w:t>
       </w:r>
@@ -3030,34 +2961,32 @@
       </w:r>
       <w:r>
         <w:rPr>
-          <w:color w:val="FF0000"/>
-          <w:rPrChange w:id="28" w:author="Henrik Frisk" w:date="2025-03-30T14:58:00Z" w16du:dateUtc="2025-03-30T12:58:00Z">
-            <w:rPr/>
+          <w:color w:val="000000" w:themeColor="text1"/>
+          <w:rPrChange w:id="17" w:author="Henrik Frisk" w:date="2026-01-01T17:21:00Z" w16du:dateUtc="2026-01-01T16:21:00Z">
+            <w:rPr>
+              <w:color w:val="FF0000"/>
+            </w:rPr>
           </w:rPrChange>
         </w:rPr>
         <w:t xml:space="preserve">många </w:t>
       </w:r>
-      <w:r>
-        <w:rPr>
-          <w:strike/>
-          <w:rPrChange w:id="29" w:author="Henrik Frisk" w:date="2025-03-30T14:58:00Z" w16du:dateUtc="2025-03-30T12:58:00Z">
-            <w:rPr/>
-          </w:rPrChange>
-        </w:rPr>
-        <w:t>över</w:t>
-      </w:r>
-      <w:r>
-        <w:t xml:space="preserve"> </w:t>
-      </w:r>
-      <w:r>
-        <w:rPr>
-          <w:strike/>
-          <w:rPrChange w:id="30" w:author="Henrik Frisk" w:date="2025-03-30T14:59:00Z" w16du:dateUtc="2025-03-30T12:59:00Z">
-            <w:rPr/>
-          </w:rPrChange>
-        </w:rPr>
-        <w:t>60</w:t>
-      </w:r>
+      <w:del w:id="18" w:author="Henrik Frisk" w:date="2026-01-01T17:21:00Z" w16du:dateUtc="2026-01-01T16:21:00Z">
+        <w:r>
+          <w:rPr>
+            <w:strike/>
+          </w:rPr>
+          <w:delText>över</w:delText>
+        </w:r>
+        <w:r>
+          <w:delText xml:space="preserve"> </w:delText>
+        </w:r>
+        <w:r>
+          <w:rPr>
+            <w:strike/>
+          </w:rPr>
+          <w:delText>60</w:delText>
+        </w:r>
+      </w:del>
       <w:r>
         <w:t xml:space="preserve"> sökanden och nästan alla stora forskningsfinansiärer ger stöd till konstnärliga forskningsprojekt. Även utlysningar i naturvetenskap och humaniora beviljar </w:t>
       </w:r>
@@ -3108,14 +3037,12 @@
         </w:rPr>
         <w:t>, i</w:t>
       </w:r>
-      <w:ins w:id="31" w:author="Henrik Frisk" w:date="2025-03-30T14:54:00Z" w16du:dateUtc="2025-03-30T12:54:00Z">
-        <w:r>
-          <w:rPr>
-            <w:lang w:val="de-DE"/>
-          </w:rPr>
-          <w:t xml:space="preserve"> </w:t>
-        </w:r>
-      </w:ins>
+      <w:r>
+        <w:rPr>
+          <w:lang w:val="de-DE"/>
+        </w:rPr>
+        <w:t xml:space="preserve"> </w:t>
+      </w:r>
       <w:proofErr w:type="spellStart"/>
       <w:r>
         <w:rPr>

</xml_diff>